<commit_message>
fix(astrologie-karmique): corrige la leçon 07 et durcit le prompt (règles 9 et 6) ; ㉘ passe A6 — un lien 404/410 bloque
- leçon : vrais titres des quatre volumes de Schulman (notices Open Library liées), « aucun volume consacré à
  Saturne », six « d'après les synthèses » réécrits (les synthèses ne nomment ni Schulman ni Greene), lien JCS
  remplacé par le texte intégral (journalpsyche.org), Horoscope.com rendue à sa phrase, Ptolémée de mémoire ; journal
- controle_attributions.py ㉘ : A6 liens morts (404/410) bloquants sauf déclarés dans le document ; citations entre
  crochets de correction exemptées dans les deux langues
- prompt : règle 9 (compter l'auteur sur la synthèse, titre sur notice), règle 6 (404 → A6)
- témoin d'avant correction ajouté ; --complet 0/0/0, témoins 1/1/1/1

Co-Authored-By: Claude Opus 5 <noreply@anthropic.com>
</commit_message>
<xml_diff>
--- a/livrables/lecons/2026-09-17_lecon-astrologie-karmique_07_saturne-retour-cycle-karma.docx
+++ b/livrables/lecons/2026-09-17_lecon-astrologie-karmique_07_saturne-retour-cycle-karma.docx
@@ -202,7 +202,7 @@
           <w:sz w:val="22"/>
           <w:szCs w:val="22"/>
         </w:rPr>
-        <w:t xml:space="preserve">situer Saturne dans la tradition astrologique ancienne et dans le corpus karmique contemporain (Schulman vols. III et IV, Liz Greene) ;</w:t>
+        <w:t xml:space="preserve">situer Saturne dans la tradition astrologique ancienne et dans le corpus karmique contemporain (Liz Greene ; et ce que le corpus de Schulman en dit — ou n'en dit pas) ;</w:t>
       </w:r>
     </w:p>
     <w:p>
@@ -496,7 +496,7 @@
           <w:sz w:val="22"/>
           <w:szCs w:val="22"/>
         </w:rPr>
-        <w:t xml:space="preserve">Dans l'astrologie hellénistique (Ptolémée, IIe s.), Saturne est une planète dite « froide et sèche », gouvernant le Capricorne et le Verseau, exaltée dans la Balance. Elle est traditionnellement associée à la limite, la discipline, la vieillesse, la mort et les contraintes structurelles. L'astrologie médiévale lui attribuait un caractère maléfique (</w:t>
+        <w:t xml:space="preserve">Dans l'astrologie hellénistique (Ptolémée, IIe s.), Saturne est une planète dite « froide et sèche », gouvernant le Capricorne et le Verseau, exaltée dans la Balance — repères traditionnels donnés de mémoire, aucune source de cette leçon ne les porte [précisé le 17/09/2026]. Elle est traditionnellement associée à la limite, la discipline, la vieillesse, la mort et les contraintes structurelles. L'astrologie médiévale lui attribuait un caractère maléfique (</w:t>
       </w:r>
       <w:r>
         <w:rPr>
@@ -616,7 +616,7 @@
           <w:sz w:val="22"/>
           <w:szCs w:val="22"/>
         </w:rPr>
-        <w:t xml:space="preserve"> traitent spécifiquement de Saturne. Le vol. III (</w:t>
+        <w:t xml:space="preserve"> — quatre volumes, 1975-1979, Samuel Weiser — n'ont aucun volume consacré à Saturne : vol. I </w:t>
       </w:r>
       <w:r>
         <w:rPr>
@@ -627,16 +627,16 @@
           <w:sz w:val="22"/>
           <w:szCs w:val="22"/>
         </w:rPr>
-        <w:t xml:space="preserve">Saturn and the Karma of Now</w:t>
-      </w:r>
-      <w:r>
-        <w:rPr>
-          <w:rFonts w:ascii="Times New Roman" w:cs="Times New Roman" w:eastAsia="Times New Roman" w:hAnsi="Times New Roman"/>
-          <w:color w:val="1F2937"/>
-          <w:sz w:val="22"/>
-          <w:szCs w:val="22"/>
-        </w:rPr>
-        <w:t xml:space="preserve">, Samuel Weiser, 1977) et le vol. IV (</w:t>
+        <w:t xml:space="preserve">The Moon's Nodes and Reincarnation</w:t>
+      </w:r>
+      <w:r>
+        <w:rPr>
+          <w:rFonts w:ascii="Times New Roman" w:cs="Times New Roman" w:eastAsia="Times New Roman" w:hAnsi="Times New Roman"/>
+          <w:color w:val="1F2937"/>
+          <w:sz w:val="22"/>
+          <w:szCs w:val="22"/>
+        </w:rPr>
+        <w:t xml:space="preserve"> (1975), vol. II </w:t>
       </w:r>
       <w:r>
         <w:rPr>
@@ -647,16 +647,98 @@
           <w:sz w:val="22"/>
           <w:szCs w:val="22"/>
         </w:rPr>
-        <w:t xml:space="preserve">Saturn and the Karma of Transformation</w:t>
-      </w:r>
-      <w:r>
-        <w:rPr>
-          <w:rFonts w:ascii="Times New Roman" w:cs="Times New Roman" w:eastAsia="Times New Roman" w:hAnsi="Times New Roman"/>
-          <w:color w:val="1F2937"/>
-          <w:sz w:val="22"/>
-          <w:szCs w:val="22"/>
-        </w:rPr>
-        <w:t xml:space="preserve">, Samuel Weiser, 1977) examinent Saturne comme vecteur du karma présent et comme outil de transformation karmique. D'après les synthèses secondaires disponibles, Schulman développe l'idée que la position natale de Saturne dans le thème indique le domaine où l'âme a contracté une dette karmique — ou, reformulé positivement, le domaine où un travail de développement est attendu dans cette incarnation. ⚠️ Ces ouvrages sont cités en bibliographie mais n'ont pas été consultés pendant cette exécution : aucune citation entre guillemets ne leur est attribuée dans cette leçon.</w:t>
+        <w:t xml:space="preserve">Retrogrades and Reincarnation</w:t>
+      </w:r>
+      <w:r>
+        <w:rPr>
+          <w:rFonts w:ascii="Times New Roman" w:cs="Times New Roman" w:eastAsia="Times New Roman" w:hAnsi="Times New Roman"/>
+          <w:color w:val="1F2937"/>
+          <w:sz w:val="22"/>
+          <w:szCs w:val="22"/>
+        </w:rPr>
+        <w:t xml:space="preserve"> (1975), vol. III </w:t>
+      </w:r>
+      <w:r>
+        <w:rPr>
+          <w:rFonts w:ascii="Times New Roman" w:cs="Times New Roman" w:eastAsia="Times New Roman" w:hAnsi="Times New Roman"/>
+          <w:i/>
+          <w:iCs/>
+          <w:color w:val="1F2937"/>
+          <w:sz w:val="22"/>
+          <w:szCs w:val="22"/>
+        </w:rPr>
+        <w:t xml:space="preserve">Joy and the Part of Fortune</w:t>
+      </w:r>
+      <w:r>
+        <w:rPr>
+          <w:rFonts w:ascii="Times New Roman" w:cs="Times New Roman" w:eastAsia="Times New Roman" w:hAnsi="Times New Roman"/>
+          <w:color w:val="1F2937"/>
+          <w:sz w:val="22"/>
+          <w:szCs w:val="22"/>
+        </w:rPr>
+        <w:t xml:space="preserve"> (1978, sur la Part de Fortune — </w:t>
+      </w:r>
+      <w:hyperlink w:history="1" r:id="rIdcorr1709ol3">
+        <w:r>
+          <w:rPr>
+            <w:rFonts w:ascii="Times New Roman" w:cs="Times New Roman" w:eastAsia="Times New Roman" w:hAnsi="Times New Roman"/>
+            <w:color w:val="1155CC"/>
+            <w:sz w:val="22"/>
+            <w:szCs w:val="22"/>
+            <w:u w:val="single"/>
+          </w:rPr>
+          <w:t xml:space="preserve">notice Open Library</w:t>
+        </w:r>
+      </w:hyperlink>
+      <w:r>
+        <w:rPr>
+          <w:rFonts w:ascii="Times New Roman" w:cs="Times New Roman" w:eastAsia="Times New Roman" w:hAnsi="Times New Roman"/>
+          <w:color w:val="1F2937"/>
+          <w:sz w:val="22"/>
+          <w:szCs w:val="22"/>
+        </w:rPr>
+        <w:t xml:space="preserve">), vol. IV </w:t>
+      </w:r>
+      <w:r>
+        <w:rPr>
+          <w:rFonts w:ascii="Times New Roman" w:cs="Times New Roman" w:eastAsia="Times New Roman" w:hAnsi="Times New Roman"/>
+          <w:i/>
+          <w:iCs/>
+          <w:color w:val="1F2937"/>
+          <w:sz w:val="22"/>
+          <w:szCs w:val="22"/>
+        </w:rPr>
+        <w:t xml:space="preserve">The Karma of the Now</w:t>
+      </w:r>
+      <w:r>
+        <w:rPr>
+          <w:rFonts w:ascii="Times New Roman" w:cs="Times New Roman" w:eastAsia="Times New Roman" w:hAnsi="Times New Roman"/>
+          <w:color w:val="1F2937"/>
+          <w:sz w:val="22"/>
+          <w:szCs w:val="22"/>
+        </w:rPr>
+        <w:t xml:space="preserve"> (1979 — </w:t>
+      </w:r>
+      <w:hyperlink w:history="1" r:id="rIdcorr1709ol4">
+        <w:r>
+          <w:rPr>
+            <w:rFonts w:ascii="Times New Roman" w:cs="Times New Roman" w:eastAsia="Times New Roman" w:hAnsi="Times New Roman"/>
+            <w:color w:val="1155CC"/>
+            <w:sz w:val="22"/>
+            <w:szCs w:val="22"/>
+            <w:u w:val="single"/>
+          </w:rPr>
+          <w:t xml:space="preserve">notice Open Library</w:t>
+        </w:r>
+      </w:hyperlink>
+      <w:r>
+        <w:rPr>
+          <w:rFonts w:ascii="Times New Roman" w:cs="Times New Roman" w:eastAsia="Times New Roman" w:hAnsi="Times New Roman"/>
+          <w:color w:val="1F2937"/>
+          <w:sz w:val="22"/>
+          <w:szCs w:val="22"/>
+        </w:rPr>
+        <w:t xml:space="preserve">). Ce que Schulman dit précisément de Saturne n'a pas été lu : les deux synthèses ouvertes pour cette leçon (Balguerie, Horoscope.com) ne le nomment pas, et ses volumes n'ont pas été consultés. La lecture « Saturne natal = domaine du karma présent » est une lecture courante du corpus, donnée ici sans source consultée. [Corrigé le 17/09/2026 : la première version citait un « vol. III, Saturn and the Karma of Now (1977) » et un « vol. IV, Saturn and the Karma of Transformation (1977) » — deux titres qui n'existent pas — et prêtait à Schulman, « d'après les synthèses secondaires », une théorie que ces synthèses ne portent pas.]</w:t>
       </w:r>
     </w:p>
     <w:p>
@@ -706,7 +788,7 @@
           <w:sz w:val="22"/>
           <w:szCs w:val="22"/>
         </w:rPr>
-        <w:t xml:space="preserve"> (Samuel Weiser, 1976, ISBN 0-87728-294-3) est considéré comme la contribution la plus importante de l'astrologie psychologique à la compréhension de Saturne. Articulant l'astronomie symbolique avec la psychologie jungienne, Greene y développe — d'après les synthèses secondaires — une lecture de Saturne comme représentation du complexe du moi inférieur (le </w:t>
+        <w:t xml:space="preserve"> (Samuel Weiser, 1976, ISBN 0-87728-294-3) est considéré comme la contribution la plus importante de l'astrologie psychologique à la compréhension de Saturne. Articulant l'astronomie symbolique avec la psychologie jungienne, Greene y développe — lecture courante du corpus, non lue dans l'ouvrage ni dans les synthèses ouvertes, qui ne la nomment pas [précisé le 17/09/2026] — une lecture de Saturne comme représentation du complexe du moi inférieur (le </w:t>
       </w:r>
       <w:r>
         <w:rPr>
@@ -830,7 +912,7 @@
                 <w:sz w:val="22"/>
                 <w:szCs w:val="22"/>
               </w:rPr>
-              <w:t xml:space="preserve"> — ont été ouvertes et lues pendant cette exécution. Les reformulations attribuées à Schulman et Greene dans cette section sont des reformulations indirectes issues de ces synthèses secondaires — non des citations des ouvrages originaux. Ce que ces ouvrages disent exactement n'a pas pu être établi pendant cette exécution.</w:t>
+              <w:t xml:space="preserve"> — ont été ouvertes et lues pendant cette exécution. Ni l'une ni l'autre ne mentionne Schulman ou Greene (vérifié le 17/09/2026 : zéro occurrence des deux noms sur les deux pages). Ce qui est prêté à ces auteurs dans cette leçon est donc une lecture courante du corpus, sans source consultée — ni les ouvrages, ni une synthèse qui les cite. [Reformulé le 17/09/2026 : la première version présentait ces attributions comme « issues de ces synthèses secondaires ».]</w:t>
             </w:r>
           </w:p>
         </w:tc>
@@ -1123,7 +1205,7 @@
                 <w:sz w:val="20"/>
                 <w:szCs w:val="20"/>
               </w:rPr>
-              <w:t xml:space="preserve">D'après les synthèses consultées (voir Ressources) : moment de passage à l'âge adulte accompli — la société cesse de faire des concessions à la jeunesse. Schulman y voit, d'après les synthèses, une confrontation directe avec le karma natal : ce qui n'a pas été construit revient sous forme de crise, de remise en question ou de structure à bâtir. Tristan Balguerie décrit ce moment comme une obligation d'intégrer Saturne — responsabilité, intégrité, passage à la maturité.</w:t>
+              <w:t xml:space="preserve">D'après les synthèses consultées (voir Ressources) : moment de passage à l'âge adulte accompli — la société cesse de faire des concessions à la jeunesse. Le corpus y voit (lecture courante, sans source consultée — corrigé le 17/09/2026, « Schulman d'après les synthèses » retiré) une confrontation directe avec le karma natal : ce qui n'a pas été construit revient sous forme de crise, de remise en question ou de structure à bâtir. Tristan Balguerie décrit ce moment comme une obligation d'intégrer Saturne — responsabilité, intégrité, passage à la maturité.</w:t>
             </w:r>
           </w:p>
         </w:tc>
@@ -1219,7 +1301,7 @@
                 <w:sz w:val="20"/>
                 <w:szCs w:val="20"/>
               </w:rPr>
-              <w:t xml:space="preserve">D'après les synthèses du corpus : moment de bilan de mi-vie avancée, souvent associé à une reconsidération de la vocation, des structures construites, du sens de l'autorité acquise. Horoscope.com le décrit comme un second bilan : le lecteur est invité à se demander ce qu'il a vraiment construit de solide (traduction et reformulation de l'anglais). Dans la perspective karmique de Schulman (d'après les synthèses), c'est un deuxième tour du même travail : ce que le premier retour a amorcé, le deuxième le consolide ou le remet en chantier.</w:t>
+              <w:t xml:space="preserve">D'après les synthèses du corpus : moment de bilan de mi-vie avancée, souvent associé à une reconsidération de la vocation, des structures construites, du sens de l'autorité acquise. Horoscope.com situe le second retour vers 59 ans et n'en dit guère plus : au second et au troisième retour, « you will eventually greet Saturn like an old friend » — l'idée d'un « second bilan » est une lecture courante du corpus, non celle de la page [corrigé le 17/09/2026]. Dans la perspective karmique (lecture courante, sans source consultée), c'est un deuxième tour du même travail : ce que le premier retour a amorcé, le deuxième le consolide ou le remet en chantier.</w:t>
             </w:r>
           </w:p>
         </w:tc>
@@ -1467,7 +1549,7 @@
           <w:sz w:val="22"/>
           <w:szCs w:val="22"/>
         </w:rPr>
-        <w:t xml:space="preserve"> — indique, selon le corpus, le mode de la contrainte et de la maturation : Saturne en Bélier vivra la limite comme une restriction de l'affirmation de soi ; en Cancer, comme une difficulté à s'enraciner ou à recevoir ; en Capricorne (signe qu'il régit dans le corpus), dans l'ambition et le rapport à l'autorité. D'après les synthèses disponibles en ligne, Schulman lit le signe natal de Saturne comme la couleur du karma structurant — le mode sous lequel la leçon de vie se présente.</w:t>
+        <w:t xml:space="preserve"> — indique, selon le corpus, le mode de la contrainte et de la maturation : Saturne en Bélier vivra la limite comme une restriction de l'affirmation de soi ; en Cancer, comme une difficulté à s'enraciner ou à recevoir ; en Capricorne (signe qu'il régit dans le corpus), dans l'ambition et le rapport à l'autorité. Le corpus lit le signe natal de Saturne comme la couleur du karma structurant — le mode sous lequel la leçon de vie se présente (lecture courante, sans source consultée ; « Schulman d'après les synthèses » retiré le 17/09/2026).</w:t>
       </w:r>
     </w:p>
     <w:p>
@@ -1660,7 +1742,7 @@
           <w:sz w:val="22"/>
           <w:szCs w:val="22"/>
         </w:rPr>
-        <w:t xml:space="preserve">D'après les synthèses du corpus (Schulman vols. III et IV, reformulation indirecte), la conjonction Saturne—Nœud Nord est souvent lue comme un thème de vie où la croissance karmique passe nécessairement par l'intégration de la structure, de la limite et de la responsabilité. La conjonction Saturne—Nœud Sud peut être lue comme un karma accumulé autour de la rigidité, de la peur ou d'une autorité mal intégrée dans des vies antérieures — un excès de Saturne à dépasser, plutôt qu'à construire. ⚠️ Ces lectures sont des reformulations indirectes issues de synthèses secondaires ; les ouvrages de Schulman n'ont pas été consultés.</w:t>
+        <w:t xml:space="preserve">Dans le corpus (lecture courante, sans source consultée — la mention « Schulman vols. III et IV » a été retirée le 17/09/2026), la conjonction Saturne—Nœud Nord est souvent lue comme un thème de vie où la croissance karmique passe nécessairement par l'intégration de la structure, de la limite et de la responsabilité. La conjonction Saturne—Nœud Sud peut être lue comme un karma accumulé autour de la rigidité, de la peur ou d'une autorité mal intégrée dans des vies antérieures — un excès de Saturne à dépasser, plutôt qu'à construire. ⚠️ Ces lectures ne sont portées ni par les ouvrages de Schulman (non consultés) ni par les synthèses ouvertes (qui ne le nomment pas) : elles sont données comme lectures courantes du corpus.</w:t>
       </w:r>
     </w:p>
     <w:p>
@@ -1699,7 +1781,7 @@
           <w:sz w:val="22"/>
           <w:szCs w:val="22"/>
         </w:rPr>
-        <w:t xml:space="preserve"> — la part de soi que le moi refuse d'intégrer et qui revient sous forme de projection ou de contrainte externe. D'après les synthèses disponibles, l'articulation avec les nœuds constitue pour elle un indicateur du domaine où ce travail d'ombre est le plus urgent dans le cycle de vie actuel. ⚠️ Même réserve : ouvrage non consulté.</w:t>
+        <w:t xml:space="preserve"> — la part de soi que le moi refuse d'intégrer et qui revient sous forme de projection ou de contrainte externe. L'articulation avec les nœuds comme indicateur du domaine où ce travail d'ombre est le plus urgent est une lecture courante du corpus — ni l'ouvrage de Greene ni les synthèses ouvertes ne la portent [précisé le 17/09/2026].</w:t>
       </w:r>
     </w:p>
     <w:p>
@@ -1878,7 +1960,7 @@
                 <w:sz w:val="20"/>
                 <w:szCs w:val="20"/>
               </w:rPr>
-              <w:t xml:space="preserve">Le corpus (Schulman, Greene, Spiller — synthèses secondaires) fait de ce cycle orbital un marqueur de paliers de maturité : le "retour de Saturne" à ~29-30 ans est le moment de la confrontation avec les structures non construites, le second palier (~58-60 ans) celui du bilan. Chaque palier est lu comme un moment de récolte karmique.</w:t>
+              <w:t xml:space="preserve">Le corpus (Balguerie et Horoscope.com, synthèses lues ; Schulman, Greene et Spiller non consultés) fait de ce cycle orbital un marqueur de paliers de maturité : le "retour de Saturne" à ~29-30 ans est le moment de la confrontation avec les structures non construites, le second palier (~58-60 ans) celui du bilan. Chaque palier est lu comme un moment de récolte karmique.</w:t>
             </w:r>
           </w:p>
         </w:tc>
@@ -2020,7 +2102,7 @@
                 <w:sz w:val="20"/>
                 <w:szCs w:val="20"/>
               </w:rPr>
-              <w:t xml:space="preserve">Le signe natal de Saturne est lu comme le mode de la contrainte ; la maison natale, comme le domaine de vie où la limite s'exerce (d'après Balguerie — synthèse consultée le 17/09/2026, voir Ressources). Schulman (d'après les synthèses) lit la maison natale de Saturne comme le domaine du karma présent.</w:t>
+              <w:t xml:space="preserve">Le signe natal de Saturne est lu comme le mode de la contrainte ; la maison natale, comme le domaine de vie où la limite s'exerce (d'après Balguerie — synthèse consultée le 17/09/2026, voir Ressources). Le corpus lit la maison natale de Saturne comme le domaine du karma présent (lecture courante, sans source consultée).</w:t>
             </w:r>
           </w:p>
         </w:tc>
@@ -2646,7 +2728,7 @@
           <w:sz w:val="22"/>
           <w:szCs w:val="22"/>
         </w:rPr>
-        <w:t xml:space="preserve">Ces deux études portent sur des affirmations générales de l'astrologie et non spécifiquement sur le retour de Saturne. Aucune étude comparative indépendante — à ma connaissance — n'a testé spécifiquement si les personnes qui vivent leur retour de Saturne connaissent des crises ou des remises en question significativement plus souvent qu'en dehors de ce moment. Le corpus traite ce point comme une évidence empirique accumulée ; elle n'a pas été soumise à une méthodologie en double aveugle.</w:t>
+        <w:t xml:space="preserve">Ces deux études portent sur des affirmations générales de l'astrologie et non spécifiquement sur le retour de Saturne. Aucune des sources ouvertes pour cette leçon ne cite d'étude comparative indépendante qui aurait testé si les personnes qui vivent leur retour de Saturne connaissent des crises ou des remises en question significativement plus souvent qu'en dehors de ce moment. Le corpus traite ce point comme une évidence empirique accumulée ; elle n'a pas été soumise à une méthodologie en double aveugle.</w:t>
       </w:r>
     </w:p>
     <w:p>
@@ -2892,7 +2974,7 @@
           <w:sz w:val="22"/>
           <w:szCs w:val="22"/>
         </w:rPr>
-        <w:t xml:space="preserve"> — Astrologie karmique, vol. III : </w:t>
+        <w:t xml:space="preserve"> — Karmic Astrology (Samuel Weiser) : vol. I </w:t>
       </w:r>
       <w:r>
         <w:rPr>
@@ -2903,16 +2985,16 @@
           <w:sz w:val="22"/>
           <w:szCs w:val="22"/>
         </w:rPr>
-        <w:t xml:space="preserve">Saturn and the Karma of Now</w:t>
-      </w:r>
-      <w:r>
-        <w:rPr>
-          <w:rFonts w:ascii="Times New Roman" w:cs="Times New Roman" w:eastAsia="Times New Roman" w:hAnsi="Times New Roman"/>
-          <w:color w:val="1F2937"/>
-          <w:sz w:val="22"/>
-          <w:szCs w:val="22"/>
-        </w:rPr>
-        <w:t xml:space="preserve"> (Samuel Weiser, 1977) ; vol. IV : </w:t>
+        <w:t xml:space="preserve">The Moon's Nodes and Reincarnation</w:t>
+      </w:r>
+      <w:r>
+        <w:rPr>
+          <w:rFonts w:ascii="Times New Roman" w:cs="Times New Roman" w:eastAsia="Times New Roman" w:hAnsi="Times New Roman"/>
+          <w:color w:val="1F2937"/>
+          <w:sz w:val="22"/>
+          <w:szCs w:val="22"/>
+        </w:rPr>
+        <w:t xml:space="preserve"> (1975) ; vol. II </w:t>
       </w:r>
       <w:r>
         <w:rPr>
@@ -2923,16 +3005,98 @@
           <w:sz w:val="22"/>
           <w:szCs w:val="22"/>
         </w:rPr>
-        <w:t xml:space="preserve">Saturn and the Karma of Transformation</w:t>
-      </w:r>
-      <w:r>
-        <w:rPr>
-          <w:rFonts w:ascii="Times New Roman" w:cs="Times New Roman" w:eastAsia="Times New Roman" w:hAnsi="Times New Roman"/>
-          <w:color w:val="1F2937"/>
-          <w:sz w:val="22"/>
-          <w:szCs w:val="22"/>
-        </w:rPr>
-        <w:t xml:space="preserve"> (Samuel Weiser, 1977). Aucune citation directe dans cette leçon.</w:t>
+        <w:t xml:space="preserve">Retrogrades and Reincarnation</w:t>
+      </w:r>
+      <w:r>
+        <w:rPr>
+          <w:rFonts w:ascii="Times New Roman" w:cs="Times New Roman" w:eastAsia="Times New Roman" w:hAnsi="Times New Roman"/>
+          <w:color w:val="1F2937"/>
+          <w:sz w:val="22"/>
+          <w:szCs w:val="22"/>
+        </w:rPr>
+        <w:t xml:space="preserve"> (1975) ; vol. III </w:t>
+      </w:r>
+      <w:r>
+        <w:rPr>
+          <w:rFonts w:ascii="Times New Roman" w:cs="Times New Roman" w:eastAsia="Times New Roman" w:hAnsi="Times New Roman"/>
+          <w:i/>
+          <w:iCs/>
+          <w:color w:val="1F2937"/>
+          <w:sz w:val="22"/>
+          <w:szCs w:val="22"/>
+        </w:rPr>
+        <w:t xml:space="preserve">Joy and the Part of Fortune</w:t>
+      </w:r>
+      <w:r>
+        <w:rPr>
+          <w:rFonts w:ascii="Times New Roman" w:cs="Times New Roman" w:eastAsia="Times New Roman" w:hAnsi="Times New Roman"/>
+          <w:color w:val="1F2937"/>
+          <w:sz w:val="22"/>
+          <w:szCs w:val="22"/>
+        </w:rPr>
+        <w:t xml:space="preserve"> (1978) — </w:t>
+      </w:r>
+      <w:hyperlink w:history="1" r:id="rIdcorr1709ol3">
+        <w:r>
+          <w:rPr>
+            <w:rFonts w:ascii="Times New Roman" w:cs="Times New Roman" w:eastAsia="Times New Roman" w:hAnsi="Times New Roman"/>
+            <w:color w:val="1155CC"/>
+            <w:sz w:val="22"/>
+            <w:szCs w:val="22"/>
+            <w:u w:val="single"/>
+          </w:rPr>
+          <w:t xml:space="preserve">openlibrary.org/isbn/087728346X</w:t>
+        </w:r>
+      </w:hyperlink>
+      <w:r>
+        <w:rPr>
+          <w:rFonts w:ascii="Times New Roman" w:cs="Times New Roman" w:eastAsia="Times New Roman" w:hAnsi="Times New Roman"/>
+          <w:color w:val="1F2937"/>
+          <w:sz w:val="22"/>
+          <w:szCs w:val="22"/>
+        </w:rPr>
+        <w:t xml:space="preserve"> ; vol. IV </w:t>
+      </w:r>
+      <w:r>
+        <w:rPr>
+          <w:rFonts w:ascii="Times New Roman" w:cs="Times New Roman" w:eastAsia="Times New Roman" w:hAnsi="Times New Roman"/>
+          <w:i/>
+          <w:iCs/>
+          <w:color w:val="1F2937"/>
+          <w:sz w:val="22"/>
+          <w:szCs w:val="22"/>
+        </w:rPr>
+        <w:t xml:space="preserve">The Karma of the Now</w:t>
+      </w:r>
+      <w:r>
+        <w:rPr>
+          <w:rFonts w:ascii="Times New Roman" w:cs="Times New Roman" w:eastAsia="Times New Roman" w:hAnsi="Times New Roman"/>
+          <w:color w:val="1F2937"/>
+          <w:sz w:val="22"/>
+          <w:szCs w:val="22"/>
+        </w:rPr>
+        <w:t xml:space="preserve"> (1979) — </w:t>
+      </w:r>
+      <w:hyperlink w:history="1" r:id="rIdcorr1709ol4">
+        <w:r>
+          <w:rPr>
+            <w:rFonts w:ascii="Times New Roman" w:cs="Times New Roman" w:eastAsia="Times New Roman" w:hAnsi="Times New Roman"/>
+            <w:color w:val="1155CC"/>
+            <w:sz w:val="22"/>
+            <w:szCs w:val="22"/>
+            <w:u w:val="single"/>
+          </w:rPr>
+          <w:t xml:space="preserve">openlibrary.org/works/OL44082589W</w:t>
+        </w:r>
+      </w:hyperlink>
+      <w:r>
+        <w:rPr>
+          <w:rFonts w:ascii="Times New Roman" w:cs="Times New Roman" w:eastAsia="Times New Roman" w:hAnsi="Times New Roman"/>
+          <w:color w:val="1F2937"/>
+          <w:sz w:val="22"/>
+          <w:szCs w:val="22"/>
+        </w:rPr>
+        <w:t xml:space="preserve">. Aucun volume consacré à Saturne ; aucune citation directe dans cette leçon. [Titres corrigés le 17/09/2026.]</w:t>
       </w:r>
     </w:p>
     <w:p>
@@ -3084,7 +3248,7 @@
             <w:szCs w:val="22"/>
             <w:u w:val="single"/>
           </w:rPr>
-          <w:t xml:space="preserve">imprint.co.uk/jcs/JCS10_6-7.html</w:t>
+          <w:t xml:space="preserve">journalpsyche.org/articles/0xc062.pdf (texte intégral, 24 pages — lien remplacé le 17/09/2026 : l'adresse imprint.co.uk publiée répondait 404)</w:t>
         </w:r>
       </w:hyperlink>
     </w:p>
@@ -3170,6 +3334,113 @@
         </w:tc>
       </w:tr>
     </w:tbl>
+    <w:p>
+      <w:r>
+        <w:t xml:space="preserve"/>
+      </w:r>
+    </w:p>
+    <w:p>
+      <w:pPr>
+        <w:spacing w:after="160" w:before="320"/>
+      </w:pPr>
+      <w:r>
+        <w:rPr>
+          <w:rFonts w:ascii="Times New Roman" w:cs="Times New Roman" w:eastAsia="Times New Roman" w:hAnsi="Times New Roman"/>
+          <w:b/>
+          <w:bCs/>
+          <w:color w:val="1B3A6B"/>
+          <w:sz w:val="30"/>
+          <w:szCs w:val="30"/>
+        </w:rPr>
+        <w:t xml:space="preserve">📝 Journal des corrections — 17 septembre 2026</w:t>
+      </w:r>
+    </w:p>
+    <w:p>
+      <w:pPr>
+        <w:spacing w:after="80"/>
+      </w:pPr>
+      <w:r>
+        <w:rPr>
+          <w:rFonts w:ascii="Times New Roman" w:cs="Times New Roman" w:eastAsia="Times New Roman" w:hAnsi="Times New Roman"/>
+          <w:b/>
+          <w:bCs/>
+          <w:color w:val="1F2937"/>
+          <w:sz w:val="22"/>
+          <w:szCs w:val="22"/>
+        </w:rPr>
+        <w:t xml:space="preserve">Leçon produite le 17/09/2026 à 9h47, relue le jour même. Le régime A (période de Saturne, NASA/JPL) et les deux études (Carlson 1985, Dean &amp; Kelly 2003) sont exacts. HUIT corrections, toutes d'attribution — aucune donnée de ciel ne change.</w:t>
+      </w:r>
+    </w:p>
+    <w:p>
+      <w:pPr>
+        <w:spacing w:after="80"/>
+      </w:pPr>
+      <w:r>
+        <w:rPr>
+          <w:rFonts w:ascii="Times New Roman" w:cs="Times New Roman" w:eastAsia="Times New Roman" w:hAnsi="Times New Roman"/>
+          <w:color w:val="1F2937"/>
+          <w:sz w:val="22"/>
+          <w:szCs w:val="22"/>
+        </w:rPr>
+        <w:t xml:space="preserve">① Deux titres inventés. « Vol. III, Saturn and the Karma of Now (Samuel Weiser, 1977) » et « vol. IV, Saturn and the Karma of Transformation (Samuel Weiser, 1977) » : les volumes III et IV de Karmic Astrology sont Joy and the Part of Fortune (1978, sur la Part de Fortune) et The Karma of the Now (1979) — notices Open Library liées. Aucun volume de Schulman n'est consacré à Saturne. Les titres sont corrigés dans la section 3 et la bibliographie ; « traitent spécifiquement de Saturne » est retiré.</w:t>
+      </w:r>
+    </w:p>
+    <w:p>
+      <w:pPr>
+        <w:spacing w:after="80"/>
+      </w:pPr>
+      <w:r>
+        <w:rPr>
+          <w:rFonts w:ascii="Times New Roman" w:cs="Times New Roman" w:eastAsia="Times New Roman" w:hAnsi="Times New Roman"/>
+          <w:color w:val="1F2937"/>
+          <w:sz w:val="22"/>
+          <w:szCs w:val="22"/>
+        </w:rPr>
+        <w:t xml:space="preserve">② Des « synthèses secondaires » qui ne nomment pas les auteurs. Six formulations — « d'après les synthèses secondaires, Schulman développe… », « Schulman y voit, d'après les synthèses… », « Greene y développe — d'après les synthèses secondaires… » — renvoyaient à Balguerie et Horoscope.com, qui ne mentionnent ni Schulman ni Greene (zéro occurrence sur les deux pages). Chacune est réécrite en « lecture courante du corpus, sans source consultée ». Règle 9 du prompt : déclarer qu'on n'a pas lu ne dispense pas de ce qu'on fait dire — et une synthèse ne porte un auteur que si elle le nomme.</w:t>
+      </w:r>
+    </w:p>
+    <w:p>
+      <w:pPr>
+        <w:spacing w:after="80"/>
+      </w:pPr>
+      <w:r>
+        <w:rPr>
+          <w:rFonts w:ascii="Times New Roman" w:cs="Times New Roman" w:eastAsia="Times New Roman" w:hAnsi="Times New Roman"/>
+          <w:color w:val="1F2937"/>
+          <w:sz w:val="22"/>
+          <w:szCs w:val="22"/>
+        </w:rPr>
+        <w:t xml:space="preserve">③ Une description prêtée à Horoscope.com : « un second bilan : le lecteur est invité à se demander ce qu'il a vraiment construit de solide ». La page dit seulement que le second retour vient vers 59 ans et que, au second et troisième retour, « you will eventually greet Saturn like an old friend ». Rendu à la page.</w:t>
+      </w:r>
+    </w:p>
+    <w:p>
+      <w:pPr>
+        <w:spacing w:after="80"/>
+      </w:pPr>
+      <w:r>
+        <w:rPr>
+          <w:rFonts w:ascii="Times New Roman" w:cs="Times New Roman" w:eastAsia="Times New Roman" w:hAnsi="Times New Roman"/>
+          <w:color w:val="1F2937"/>
+          <w:sz w:val="22"/>
+          <w:szCs w:val="22"/>
+        </w:rPr>
+        <w:t xml:space="preserve">④ Un lien mort publié : imprint.co.uk/jcs/JCS10_6-7.html répond 404. Remplacé par le texte intégral de l'article (journalpsyche.org, PDF de 24 pages, « Journal of Consciousness Studies, 10, No. 6–7, 2003, pp. 175–198 », « 2,101 persons born in London during 3–9 March 1958 »).</w:t>
+      </w:r>
+    </w:p>
+    <w:p>
+      <w:pPr>
+        <w:spacing w:after="80"/>
+      </w:pPr>
+      <w:r>
+        <w:rPr>
+          <w:rFonts w:ascii="Times New Roman" w:cs="Times New Roman" w:eastAsia="Times New Roman" w:hAnsi="Times New Roman"/>
+          <w:color w:val="1F2937"/>
+          <w:sz w:val="22"/>
+          <w:szCs w:val="22"/>
+        </w:rPr>
+        <w:t xml:space="preserve">⑤ Les repères de Ptolémée (froide et sèche, Capricorne et Verseau, exaltation en Balance) sont dits de mémoire ; la négation « à ma connaissance, aucune étude… » devient « aucune des sources ouvertes ne cite d'étude… ». Formulations d'origine conservées ci-dessus.</w:t>
+      </w:r>
+    </w:p>
     <w:sectPr>
       <w:pgSz w:w="11906" w:h="16838" w:orient="portrait"/>
       <w:pgMar w:top="1440" w:right="1440" w:bottom="1440" w:left="1440" w:header="708" w:footer="708" w:gutter="0"/>

</xml_diff>